<commit_message>
Refaz a home, cria a landing dos vídeos e transforma a área do cliente em app
- Home nova com prints reais do app, planos com papel claro (Presença:
  você posta; Crescimento: social media; Autoridade: social media +
  tráfego), comparativo, pacotes de crédito de volta e formulário de
  interessados no lugar do briefing
- Landing de campanha em /videos com 3 vídeos de exemplo (marcas
  fictícias) e barra fixa no celular
- App do cliente instalável (PWA) com Início, Conteúdos, Calendário e
  Conta; painel da agência com visão geral e aba de interessados
- Tabela leads no schema; modo demonstração via ?demo=1
- Crescimento sem gestão de tráfego nos modelos de contrato, na
  proposta e no briefing da JL Fitness

Co-Authored-By: Claude Opus 5.5 <noreply@anthropic.com>
Claude-Session: https://claude.ai/code/session_01SSsGQ7eaL5NEhgBCfBotZy
</commit_message>
<xml_diff>
--- a/propostas/contratos/contrato-plano-crescimento.docx
+++ b/propostas/contratos/contrato-plano-crescimento.docx
@@ -190,19 +190,7 @@
         <w:rPr>
           <w:b w:val="0"/>
         </w:rPr>
-        <w:t xml:space="preserve"> e </w:t>
-      </w:r>
-      <w:r>
-        <w:rPr>
-          <w:b/>
-        </w:rPr>
-        <w:t>gestão de tráfego pago</w:t>
-      </w:r>
-      <w:r>
-        <w:rPr>
-          <w:b w:val="0"/>
-        </w:rPr>
-        <w:t xml:space="preserve"> para o perfil do CONTRATANTE, conforme o </w:t>
+        <w:t xml:space="preserve"> (criação, programação e publicação de conteúdo) para o perfil do CONTRATANTE, conforme o </w:t>
       </w:r>
       <w:r>
         <w:rPr>
@@ -313,17 +301,6 @@
         <w:rPr>
           <w:b w:val="0"/>
         </w:rPr>
-        <w:t>• gestão das campanhas de tráfego pago do CONTRATANTE;</w:t>
-      </w:r>
-    </w:p>
-    <w:p>
-      <w:pPr>
-        <w:ind w:left="340"/>
-      </w:pPr>
-      <w:r>
-        <w:rPr>
-          <w:b w:val="0"/>
-        </w:rPr>
         <w:t>• até 2 (dois) ajustes no mês, conforme a Cláusula 3.</w:t>
       </w:r>
     </w:p>
@@ -332,7 +309,7 @@
         <w:rPr>
           <w:b w:val="0"/>
         </w:rPr>
-        <w:t>1.2. Não estão incluídos no objeto deste contrato: o valor investido nos anúncios (verba de mídia), que será pago pelo CONTRATANTE diretamente à plataforma de anúncios; o atendimento e a resposta de mensagens de clientes do CONTRATANTE; e quaisquer serviços não descritos no item 1.1.</w:t>
+        <w:t>1.2. Os anúncios do item 1.1 são entregues como peças prontas. Não estão incluídos no objeto deste contrato: a gestão de tráfego pago; o valor investido em anúncios, se houver, que será pago pelo CONTRATANTE diretamente à plataforma; o atendimento e a resposta de mensagens de clientes do CONTRATANTE; e quaisquer serviços não descritos no item 1.1.</w:t>
       </w:r>
     </w:p>
     <w:p>
@@ -760,18 +737,7 @@
         <w:rPr>
           <w:b w:val="0"/>
         </w:rPr>
-        <w:t>d) gerir as campanhas de tráfego pago com a verba definida pelo CONTRATANTE;</w:t>
-      </w:r>
-    </w:p>
-    <w:p>
-      <w:pPr>
-        <w:ind w:left="340"/>
-      </w:pPr>
-      <w:r>
-        <w:rPr>
-          <w:b w:val="0"/>
-        </w:rPr>
-        <w:t>e) manter sigilo sobre as informações do CONTRATANTE e usar os acessos recebidos apenas para a execução deste contrato.</w:t>
+        <w:t>d) manter sigilo sobre as informações do CONTRATANTE e usar os acessos recebidos apenas para a execução deste contrato.</w:t>
       </w:r>
     </w:p>
     <w:p>
@@ -829,7 +795,7 @@
         <w:rPr>
           <w:b w:val="0"/>
         </w:rPr>
-        <w:t>d) liberar os acessos necessários ao perfil e à conta de anúncios, sem necessidade de informar senhas pessoais;</w:t>
+        <w:t>d) liberar os acessos necessários ao perfil, sem necessidade de informar senhas pessoais;</w:t>
       </w:r>
     </w:p>
     <w:p>
@@ -851,7 +817,7 @@
         <w:rPr>
           <w:b w:val="0"/>
         </w:rPr>
-        <w:t>f) pagar a verba dos anúncios diretamente à plataforma;</w:t>
+        <w:t>f) pagar a verba dos anúncios, se houver, diretamente à plataforma;</w:t>
       </w:r>
     </w:p>
     <w:p>
@@ -884,7 +850,7 @@
         <w:rPr>
           <w:b w:val="0"/>
         </w:rPr>
-        <w:t xml:space="preserve">8.1. A CONTRATADA se compromete a aplicar as melhores práticas de conteúdo e tráfego pago. Como os resultados dependem de fatores fora do controle da CONTRATADA, como o mercado, a oferta, o preço e o atendimento do CONTRATANTE, </w:t>
+        <w:t xml:space="preserve">8.1. A CONTRATADA se compromete a aplicar as melhores práticas de conteúdo. Como os resultados dependem de fatores fora do controle da CONTRATADA, como o mercado, a oferta, o preço e o atendimento do CONTRATANTE, </w:t>
       </w:r>
       <w:r>
         <w:rPr>

</xml_diff>